<commit_message>
se le cambio los titulos en negrita
</commit_message>
<xml_diff>
--- a/requisitos de jonier.docx
+++ b/requisitos de jonier.docx
@@ -493,14 +493,6 @@
         </w:rPr>
         <w:t>TABLA COMPARATIVA.</w:t>
       </w:r>
-    </w:p>
-    <w:p>
-      <w:pPr>
-        <w:jc w:val="center"/>
-        <w:rPr>
-          <w:rFonts w:ascii="Arial" w:eastAsia="Arial" w:hAnsi="Arial" w:cs="Arial"/>
-        </w:rPr>
-      </w:pPr>
     </w:p>
     <w:tbl>
       <w:tblPr>
@@ -1928,7 +1920,6 @@
               <w:rPr>
                 <w:rFonts w:ascii="Arial" w:eastAsia="Arial" w:hAnsi="Arial" w:cs="Arial"/>
               </w:rPr>
-              <w:lastRenderedPageBreak/>
               <w:t>Tiempo de documentación</w:t>
             </w:r>
           </w:p>
@@ -1975,7 +1966,16 @@
                 <w:sz w:val="22"/>
                 <w:szCs w:val="22"/>
               </w:rPr>
-              <w:t>Invertido a lo largo del ciclo de vida para asegurar la calidad y el proceso.</w:t>
+              <w:t xml:space="preserve">Invertido a lo largo del ciclo de vida para </w:t>
+            </w:r>
+            <w:r>
+              <w:rPr>
+                <w:rFonts w:ascii="Arial" w:eastAsia="Arial" w:hAnsi="Arial" w:cs="Arial"/>
+                <w:sz w:val="22"/>
+                <w:szCs w:val="22"/>
+              </w:rPr>
+              <w:lastRenderedPageBreak/>
+              <w:t>asegurar la calidad y el proceso.</w:t>
             </w:r>
           </w:p>
         </w:tc>
@@ -1998,7 +1998,17 @@
                 <w:sz w:val="22"/>
                 <w:szCs w:val="22"/>
               </w:rPr>
-              <w:t>Corto inicialmente (la conversación es el foco), refinamiento continuo.</w:t>
+              <w:lastRenderedPageBreak/>
+              <w:t xml:space="preserve">Corto inicialmente (la conversación es el foco), </w:t>
+            </w:r>
+            <w:r>
+              <w:rPr>
+                <w:rFonts w:ascii="Arial" w:eastAsia="Arial" w:hAnsi="Arial" w:cs="Arial"/>
+                <w:sz w:val="22"/>
+                <w:szCs w:val="22"/>
+              </w:rPr>
+              <w:lastRenderedPageBreak/>
+              <w:t>refinamiento continuo.</w:t>
             </w:r>
           </w:p>
         </w:tc>
@@ -2022,6 +2032,7 @@
               <w:rPr>
                 <w:rFonts w:ascii="Arial" w:eastAsia="Arial" w:hAnsi="Arial" w:cs="Arial"/>
               </w:rPr>
+              <w:lastRenderedPageBreak/>
               <w:t>Facilidad de mantenimiento</w:t>
             </w:r>
           </w:p>
@@ -2379,35 +2390,7 @@
         <w:rPr>
           <w:rFonts w:ascii="Arial" w:eastAsia="Arial" w:hAnsi="Arial" w:cs="Arial"/>
         </w:rPr>
-        <w:t xml:space="preserve">l </w:t>
-      </w:r>
-      <w:proofErr w:type="spellStart"/>
-      <w:r>
-        <w:rPr>
-          <w:rFonts w:ascii="Arial" w:eastAsia="Arial" w:hAnsi="Arial" w:cs="Arial"/>
-        </w:rPr>
-        <w:t>Advanced</w:t>
-      </w:r>
-      <w:proofErr w:type="spellEnd"/>
-      <w:r>
-        <w:rPr>
-          <w:rFonts w:ascii="Arial" w:eastAsia="Arial" w:hAnsi="Arial" w:cs="Arial"/>
-        </w:rPr>
-        <w:t xml:space="preserve"> </w:t>
-      </w:r>
-      <w:proofErr w:type="spellStart"/>
-      <w:r>
-        <w:rPr>
-          <w:rFonts w:ascii="Arial" w:eastAsia="Arial" w:hAnsi="Arial" w:cs="Arial"/>
-        </w:rPr>
-        <w:t>Level</w:t>
-      </w:r>
-      <w:proofErr w:type="spellEnd"/>
-      <w:r>
-        <w:rPr>
-          <w:rFonts w:ascii="Arial" w:eastAsia="Arial" w:hAnsi="Arial" w:cs="Arial"/>
-        </w:rPr>
-        <w:t xml:space="preserve"> permite a los profesionales profundizar y especializarse en áreas clave, ofreciendo módulos independientes como la Elicitación, el Modelado</w:t>
+        <w:t>l Advanced Level permite a los profesionales profundizar y especializarse en áreas clave, ofreciendo módulos independientes como la Elicitación, el Modelado</w:t>
       </w:r>
       <w:r>
         <w:rPr>
@@ -3823,11 +3806,15 @@
         <w:jc w:val="center"/>
         <w:rPr>
           <w:rFonts w:ascii="Arial" w:eastAsia="Arial" w:hAnsi="Arial" w:cs="Arial"/>
-        </w:rPr>
-      </w:pPr>
-      <w:r>
-        <w:rPr>
-          <w:rFonts w:ascii="Arial" w:eastAsia="Arial" w:hAnsi="Arial" w:cs="Arial"/>
+          <w:b/>
+          <w:bCs/>
+        </w:rPr>
+      </w:pPr>
+      <w:r>
+        <w:rPr>
+          <w:rFonts w:ascii="Arial" w:eastAsia="Arial" w:hAnsi="Arial" w:cs="Arial"/>
+          <w:b/>
+          <w:bCs/>
         </w:rPr>
         <w:lastRenderedPageBreak/>
         <w:t>EJERCICIO PRÁCTICO</w:t>
@@ -4388,9 +4375,17 @@
       </w:pPr>
     </w:p>
     <w:p>
-      <w:r>
-        <w:rPr>
-          <w:rFonts w:ascii="Arial" w:eastAsia="Arial" w:hAnsi="Arial" w:cs="Arial"/>
+      <w:pPr>
+        <w:rPr>
+          <w:b/>
+          <w:bCs/>
+        </w:rPr>
+      </w:pPr>
+      <w:r>
+        <w:rPr>
+          <w:rFonts w:ascii="Arial" w:eastAsia="Arial" w:hAnsi="Arial" w:cs="Arial"/>
+          <w:b/>
+          <w:bCs/>
         </w:rPr>
         <w:t>FLUJOS ALTERNATIVOS:</w:t>
       </w:r>
@@ -4486,9 +4481,17 @@
       </w:r>
     </w:p>
     <w:p>
-      <w:r>
-        <w:rPr>
-          <w:rFonts w:ascii="Arial" w:eastAsia="Arial" w:hAnsi="Arial" w:cs="Arial"/>
+      <w:pPr>
+        <w:rPr>
+          <w:b/>
+          <w:bCs/>
+        </w:rPr>
+      </w:pPr>
+      <w:r>
+        <w:rPr>
+          <w:rFonts w:ascii="Arial" w:eastAsia="Arial" w:hAnsi="Arial" w:cs="Arial"/>
+          <w:b/>
+          <w:bCs/>
         </w:rPr>
         <w:t>POSTCONDICIONES:</w:t>
       </w:r>
@@ -4553,9 +4556,17 @@
       </w:r>
     </w:p>
     <w:p>
-      <w:r>
-        <w:rPr>
-          <w:rFonts w:ascii="Arial" w:eastAsia="Arial" w:hAnsi="Arial" w:cs="Arial"/>
+      <w:pPr>
+        <w:rPr>
+          <w:b/>
+          <w:bCs/>
+        </w:rPr>
+      </w:pPr>
+      <w:r>
+        <w:rPr>
+          <w:rFonts w:ascii="Arial" w:eastAsia="Arial" w:hAnsi="Arial" w:cs="Arial"/>
+          <w:b/>
+          <w:bCs/>
         </w:rPr>
         <w:t>REGLAS DE NEGOCIO:</w:t>
       </w:r>
@@ -4645,9 +4656,17 @@
       </w:r>
     </w:p>
     <w:p>
-      <w:r>
-        <w:rPr>
-          <w:rFonts w:ascii="Arial" w:eastAsia="Arial" w:hAnsi="Arial" w:cs="Arial"/>
+      <w:pPr>
+        <w:rPr>
+          <w:b/>
+          <w:bCs/>
+        </w:rPr>
+      </w:pPr>
+      <w:r>
+        <w:rPr>
+          <w:rFonts w:ascii="Arial" w:eastAsia="Arial" w:hAnsi="Arial" w:cs="Arial"/>
+          <w:b/>
+          <w:bCs/>
         </w:rPr>
         <w:t>CRITERIOS DE ACEPTACIÓN:</w:t>
       </w:r>

</xml_diff>